<commit_message>
chore: backup completo de BD (archivo + esquema + dump) y cambios pendientes
</commit_message>
<xml_diff>
--- a/backend/Template Propuestas.docx
+++ b/backend/Template Propuestas.docx
@@ -2,36 +2,6 @@
 <file path=word/document.xml><?xml version="1.0" encoding="utf-8"?>
 <w:document xmlns:wpc="http://schemas.microsoft.com/office/word/2010/wordprocessingCanvas" xmlns:cx="http://schemas.microsoft.com/office/drawing/2014/chartex" xmlns:cx1="http://schemas.microsoft.com/office/drawing/2015/9/8/chartex" xmlns:cx2="http://schemas.microsoft.com/office/drawing/2015/10/21/chartex" xmlns:cx3="http://schemas.microsoft.com/office/drawing/2016/5/9/chartex" xmlns:cx4="http://schemas.microsoft.com/office/drawing/2016/5/10/chartex" xmlns:cx5="http://schemas.microsoft.com/office/drawing/2016/5/11/chartex" xmlns:cx6="http://schemas.microsoft.com/office/drawing/2016/5/12/chartex" xmlns:cx7="http://schemas.microsoft.com/office/drawing/2016/5/13/chartex" xmlns:cx8="http://schemas.microsoft.com/office/drawing/2016/5/14/chartex" xmlns:mc="http://schemas.openxmlformats.org/markup-compatibility/2006" xmlns:aink="http://schemas.microsoft.com/office/drawing/2016/ink" xmlns:am3d="http://schemas.microsoft.com/office/drawing/2017/model3d" xmlns:o="urn:schemas-microsoft-com:office:office" xmlns:oel="http://schemas.microsoft.com/office/2019/extlst" xmlns:r="http://schemas.openxmlformats.org/officeDocument/2006/relationships" xmlns:m="http://schemas.openxmlformats.org/officeDocument/2006/math" xmlns:v="urn:schemas-microsoft-com:vml" xmlns:wp14="http://schemas.microsoft.com/office/word/2010/wordprocessingDrawing" xmlns:wp="http://schemas.openxmlformats.org/drawingml/2006/wordprocessingDrawing" xmlns:w10="urn:schemas-microsoft-com:office:word" xmlns:w="http://schemas.openxmlformats.org/wordprocessingml/2006/main" xmlns:w14="http://schemas.microsoft.com/office/word/2010/wordml" xmlns:w15="http://schemas.microsoft.com/office/word/2012/wordml" xmlns:w16cex="http://schemas.microsoft.com/office/word/2018/wordml/cex" xmlns:w16cid="http://schemas.microsoft.com/office/word/2016/wordml/cid" xmlns:w16="http://schemas.microsoft.com/office/word/2018/wordml" xmlns:w16du="http://schemas.microsoft.com/office/word/2023/wordml/word16du" xmlns:w16sdtdh="http://schemas.microsoft.com/office/word/2020/wordml/sdtdatahash" xmlns:w16sdtfl="http://schemas.microsoft.com/office/word/2024/wordml/sdtformatlock" xmlns:w16se="http://schemas.microsoft.com/office/word/2015/wordml/symex" xmlns:wpg="http://schemas.microsoft.com/office/word/2010/wordprocessingGroup" xmlns:wpi="http://schemas.microsoft.com/office/word/2010/wordprocessingInk" xmlns:wne="http://schemas.microsoft.com/office/word/2006/wordml" xmlns:wps="http://schemas.microsoft.com/office/word/2010/wordprocessingShape" mc:Ignorable="w14 w15 w16se w16cid w16 w16cex w16sdtdh w16sdtfl w16du wp14">
   <w:body>
-    <w:p>
-      <w:r>
-        <w:t>Cuatrimestre: {{cuat}}</w:t>
-      </w:r>
-    </w:p>
-    <w:p>
-      <w:r>
-        <w:t>Año de Carrera: {{anio}}</w:t>
-      </w:r>
-    </w:p>
-    <w:p>
-      <w:r>
-        <w:t>Ciclo: Profesional</w:t>
-      </w:r>
-    </w:p>
-    <w:p>
-      <w:r>
-        <w:t>Plan de Estudio: {{plan}}</w:t>
-      </w:r>
-    </w:p>
-    <w:p>
-      <w:r>
-        <w:t>Asignatura: {{nombreAsignatura}}</w:t>
-      </w:r>
-    </w:p>
-    <w:p>
-      <w:r>
-        <w:t>Carrera: {{nombreCarrera}}</w:t>
-      </w:r>
-    </w:p>
     <w:p>
       <w:pPr>
         <w:pStyle w:val="Ttulo"/>
@@ -1456,7 +1426,21 @@
               <w:rPr>
                 <w:u w:val="single"/>
               </w:rPr>
-              <w:t>Resultados de aprendizaje de la asignatura (redactar de acuerdo a las competencias y descriptores a las que aporta la asignatura)</w:t>
+              <w:t xml:space="preserve">Resultados de aprendizaje de la asignatura (redactar </w:t>
+            </w:r>
+            <w:proofErr w:type="gramStart"/>
+            <w:r>
+              <w:rPr>
+                <w:u w:val="single"/>
+              </w:rPr>
+              <w:t>de acuerdo a</w:t>
+            </w:r>
+            <w:proofErr w:type="gramEnd"/>
+            <w:r>
+              <w:rPr>
+                <w:u w:val="single"/>
+              </w:rPr>
+              <w:t xml:space="preserve"> las competencias y descriptores a las que aporta la asignatura)</w:t>
             </w:r>
           </w:p>
           <w:p>
@@ -2324,6 +2308,7 @@
                 <w:szCs w:val="20"/>
               </w:rPr>
             </w:pPr>
+            <w:proofErr w:type="gramStart"/>
             <w:r>
               <w:rPr>
                 <w:b/>
@@ -2332,7 +2317,18 @@
                 <w:sz w:val="20"/>
                 <w:szCs w:val="20"/>
               </w:rPr>
-              <w:t>Actividades a desarrollar (especificar las actividades formativas necesarias para lograr que el estudiante alcance el/los RA especificados):</w:t>
+              <w:t>Actividades a desarrollar</w:t>
+            </w:r>
+            <w:proofErr w:type="gramEnd"/>
+            <w:r>
+              <w:rPr>
+                <w:b/>
+                <w:bCs/>
+                <w:color w:val="000000"/>
+                <w:sz w:val="20"/>
+                <w:szCs w:val="20"/>
+              </w:rPr>
+              <w:t xml:space="preserve"> (especificar las actividades formativas necesarias para lograr que el estudiante alcance el/los RA especificados):</w:t>
             </w:r>
           </w:p>
           <w:p>
@@ -3205,7 +3201,7 @@
               </wp:anchor>
             </w:drawing>
           </mc:Choice>
-          <mc:Fallback xmlns:sl="http://schemas.openxmlformats.org/schemaLibrary/2006/main" xmlns:a="http://schemas.openxmlformats.org/drawingml/2006/main" xmlns:pic="http://schemas.openxmlformats.org/drawingml/2006/picture" xmlns:c="http://schemas.openxmlformats.org/drawingml/2006/chart" xmlns:lc="http://schemas.openxmlformats.org/drawingml/2006/lockedCanvas" xmlns:dgm="http://schemas.openxmlformats.org/drawingml/2006/diagram" xmlns="http://schemas.microsoft.com/office/tasks/2019/documenttasks" xmlns:cr="http://schemas.microsoft.com/office/comments/2020/reactions">
+          <mc:Fallback xmlns:cr="http://schemas.microsoft.com/office/comments/2020/reactions" xmlns="http://schemas.microsoft.com/office/tasks/2019/documenttasks" xmlns:dgm="http://schemas.openxmlformats.org/drawingml/2006/diagram" xmlns:lc="http://schemas.openxmlformats.org/drawingml/2006/lockedCanvas" xmlns:c="http://schemas.openxmlformats.org/drawingml/2006/chart" xmlns:pic="http://schemas.openxmlformats.org/drawingml/2006/picture" xmlns:a="http://schemas.openxmlformats.org/drawingml/2006/main" xmlns:sl="http://schemas.openxmlformats.org/schemaLibrary/2006/main">
             <w:drawing>
               <wp:anchor allowOverlap="1" behindDoc="0" distB="0" distT="0" distL="114300" distR="114300" hidden="0" layoutInCell="1" locked="0" relativeHeight="0" simplePos="0">
                 <wp:simplePos x="0" y="0"/>
@@ -3470,12 +3466,21 @@
                             <w:ind w:left="20" w:firstLine="20"/>
                             <w:textDirection w:val="btLr"/>
                           </w:pPr>
+                          <w:proofErr w:type="gramStart"/>
                           <w:r>
                             <w:rPr>
                               <w:color w:val="000000"/>
                               <w:sz w:val="20"/>
                             </w:rPr>
-                            <w:t>Página  PAGE 6 de 9</w:t>
+                            <w:t>Página  PAGE</w:t>
+                          </w:r>
+                          <w:proofErr w:type="gramEnd"/>
+                          <w:r>
+                            <w:rPr>
+                              <w:color w:val="000000"/>
+                              <w:sz w:val="20"/>
+                            </w:rPr>
+                            <w:t xml:space="preserve"> 6 de 9</w:t>
                           </w:r>
                         </w:p>
                       </w:txbxContent>

</xml_diff>